<commit_message>
Quitar la mención de Andrés Figueroa y la supervisión de TFS del CV, portafolio y Word
Co-Authored-By: Claude Sonnet 5.5 <noreply@anthropic.com>
Claude-Session: https://claude.ai/code/session_01Qz2v3pBufXuWxCEeuDhn6M dariocsosa/truthframe@8d52d1f27dbe26e824ec0a3a46938d93d93d8d77
</commit_message>
<xml_diff>
--- a/assets/diana/Diana_Cardona_CV.docx
+++ b/assets/diana/Diana_Cardona_CV.docx
@@ -146,7 +146,7 @@
             <w:pPr>
               <w:spacing w:after="380"/>
             </w:pPr>
-            <w:hyperlink w:history="1" r:id="rId3dv1ubpkiji01maruayol">
+            <w:hyperlink w:history="1" r:id="rIds8qt1bbhvampyu-xee9s9">
               <w:r>
                 <w:rPr>
                   <w:rFonts w:ascii="Calibri" w:cs="Calibri" w:eastAsia="Calibri" w:hAnsi="Calibri"/>
@@ -167,7 +167,7 @@
               </w:rPr>
               <w:t xml:space="preserve"> · </w:t>
             </w:r>
-            <w:hyperlink w:history="1" r:id="rIdsomowitbmzzlkvlgxlxk4">
+            <w:hyperlink w:history="1" r:id="rIde2j186c3dgrhyraj-qwt_">
               <w:r>
                 <w:rPr>
                   <w:rFonts w:ascii="Calibri" w:cs="Calibri" w:eastAsia="Calibri" w:hAnsi="Calibri"/>
@@ -1075,7 +1075,7 @@
           <w:sz w:val="20"/>
           <w:szCs w:val="20"/>
         </w:rPr>
-        <w:t xml:space="preserve">Tiempo completo, con horario compatible con Ciudad de México. Andrés Figueroa continúa dirigiendo Truth Frame Studio y yo lo superviso.</w:t>
+        <w:t xml:space="preserve">Tiempo completo, con horario compatible con Ciudad de México.</w:t>
       </w:r>
     </w:p>
     <w:sectPr>

</xml_diff>

<commit_message>
Postulación de Diana: texto con sus datos nuevos (capacitación, gestión de listas, electiva), 'Carta' pasa a 'Postulación'
Co-Authored-By: Claude Sonnet 5.5 <noreply@anthropic.com>
Claude-Session: https://claude.ai/code/session_01Qz2v3pBufXuWxCEeuDhn6M dariocsosa/truthframe@f6fc4f49fddfed53b7da26e39b467a6b9bd68412
</commit_message>
<xml_diff>
--- a/assets/diana/Diana_Cardona_CV.docx
+++ b/assets/diana/Diana_Cardona_CV.docx
@@ -146,7 +146,7 @@
             <w:pPr>
               <w:spacing w:after="380"/>
             </w:pPr>
-            <w:hyperlink w:history="1" r:id="rIds8qt1bbhvampyu-xee9s9">
+            <w:hyperlink w:history="1" r:id="rIdivzuatnfyemlf1wel6qol">
               <w:r>
                 <w:rPr>
                   <w:rFonts w:ascii="Calibri" w:cs="Calibri" w:eastAsia="Calibri" w:hAnsi="Calibri"/>
@@ -167,7 +167,7 @@
               </w:rPr>
               <w:t xml:space="preserve"> · </w:t>
             </w:r>
-            <w:hyperlink w:history="1" r:id="rIde2j186c3dgrhyraj-qwt_">
+            <w:hyperlink w:history="1" r:id="rIdsttphvxitcspa3podwf7f">
               <w:r>
                 <w:rPr>
                   <w:rFonts w:ascii="Calibri" w:cs="Calibri" w:eastAsia="Calibri" w:hAnsi="Calibri"/>
@@ -572,7 +572,7 @@
           <w:sz w:val="20"/>
           <w:szCs w:val="20"/>
         </w:rPr>
-        <w:t xml:space="preserve">Desde 2026, asesoría 1:1 a canales: diagnóstico con datos de YouTube Studio, arquitectura de contenidos y planificación editorial a partir del comportamiento de la audiencia.</w:t>
+        <w:t xml:space="preserve">Desde 2026, asesoría 1:1 a canales: diagnóstico con datos de YouTube Studio, arquitectura de contenidos y planificación editorial. Capacitación del equipo de producción de Eternidad Plus en la plataforma.</w:t>
       </w:r>
     </w:p>
     <w:p>
@@ -798,6 +798,31 @@
           <w:sz w:val="20"/>
           <w:szCs w:val="20"/>
         </w:rPr>
+        <w:t xml:space="preserve">Gestión del canal. </w:t>
+      </w:r>
+      <w:r>
+        <w:rPr>
+          <w:rFonts w:ascii="Calibri" w:cs="Calibri" w:eastAsia="Calibri" w:hAnsi="Calibri"/>
+          <w:color w:val="1D1D1D"/>
+          <w:sz w:val="20"/>
+          <w:szCs w:val="20"/>
+        </w:rPr>
+        <w:t xml:space="preserve">Analítica en YouTube Studio, arquitectura de listas de reproducción y estructura de la página principal para favorecer el descubrimiento de contenido.</w:t>
+      </w:r>
+    </w:p>
+    <w:p>
+      <w:pPr>
+        <w:spacing w:after="100" w:line="276"/>
+      </w:pPr>
+      <w:r>
+        <w:rPr>
+          <w:rFonts w:ascii="Calibri" w:cs="Calibri" w:eastAsia="Calibri" w:hAnsi="Calibri"/>
+          <w:b/>
+          <w:bCs/>
+          <w:color w:val="1D1D1D"/>
+          <w:sz w:val="20"/>
+          <w:szCs w:val="20"/>
+        </w:rPr>
         <w:t xml:space="preserve">Conferencias Mujer Verdadera. </w:t>
       </w:r>
       <w:r>
@@ -1041,6 +1066,31 @@
           <w:sz w:val="20"/>
           <w:szCs w:val="20"/>
         </w:rPr>
+        <w:t xml:space="preserve">Docencia. </w:t>
+      </w:r>
+      <w:r>
+        <w:rPr>
+          <w:rFonts w:ascii="Calibri" w:cs="Calibri" w:eastAsia="Calibri" w:hAnsi="Calibri"/>
+          <w:color w:val="1D1D1D"/>
+          <w:sz w:val="20"/>
+          <w:szCs w:val="20"/>
+        </w:rPr>
+        <w:t xml:space="preserve">Electiva de YouTube para estudiantes de secundaria.</w:t>
+      </w:r>
+    </w:p>
+    <w:p>
+      <w:pPr>
+        <w:spacing w:after="100" w:line="276"/>
+      </w:pPr>
+      <w:r>
+        <w:rPr>
+          <w:rFonts w:ascii="Calibri" w:cs="Calibri" w:eastAsia="Calibri" w:hAnsi="Calibri"/>
+          <w:b/>
+          <w:bCs/>
+          <w:color w:val="1D1D1D"/>
+          <w:sz w:val="20"/>
+          <w:szCs w:val="20"/>
+        </w:rPr>
         <w:t xml:space="preserve">Idiomas. </w:t>
       </w:r>
       <w:r>
@@ -1050,7 +1100,7 @@
           <w:sz w:val="20"/>
           <w:szCs w:val="20"/>
         </w:rPr>
-        <w:t xml:space="preserve">Español nativo. Inglés intermedio: lo entiendo bien y necesito práctica para hablarlo con fluidez.</w:t>
+        <w:t xml:space="preserve">Español nativo. Inglés intermedio.</w:t>
       </w:r>
     </w:p>
     <w:p>

</xml_diff>